<commit_message>
Updated the COV Motion document with the language requested.
</commit_message>
<xml_diff>
--- a/docassemble/USCISApplications/data/templates/COV_motion.docx
+++ b/docassemble/USCISApplications/data/templates/COV_motion.docx
@@ -49,6 +49,7 @@
         </w:rPr>
         <w:tab/>
       </w:r>
+      <w:proofErr w:type="spellStart"/>
       <w:r>
         <w:rPr>
           <w:b/>
@@ -56,6 +57,7 @@
         </w:rPr>
         <w:t>NonDetained</w:t>
       </w:r>
+      <w:proofErr w:type="spellEnd"/>
     </w:p>
     <w:p/>
     <w:p/>
@@ -119,8 +121,38 @@
         <w:rPr>
           <w:b/>
         </w:rPr>
-        <w:t>{% if dhs.different_court_location %}{{ dhs.court_city</w:t>
-      </w:r>
+        <w:t xml:space="preserve">{% if </w:t>
+      </w:r>
+      <w:proofErr w:type="spellStart"/>
+      <w:proofErr w:type="gramStart"/>
+      <w:r>
+        <w:rPr>
+          <w:b/>
+        </w:rPr>
+        <w:t>dhs.different</w:t>
+      </w:r>
+      <w:proofErr w:type="gramEnd"/>
+      <w:r>
+        <w:rPr>
+          <w:b/>
+        </w:rPr>
+        <w:t>_court_location</w:t>
+      </w:r>
+      <w:proofErr w:type="spellEnd"/>
+      <w:r>
+        <w:rPr>
+          <w:b/>
+        </w:rPr>
+        <w:t xml:space="preserve"> %}{{ </w:t>
+      </w:r>
+      <w:proofErr w:type="spellStart"/>
+      <w:r>
+        <w:rPr>
+          <w:b/>
+        </w:rPr>
+        <w:t>dhs.court_city</w:t>
+      </w:r>
+      <w:proofErr w:type="spellEnd"/>
       <w:r>
         <w:rPr>
           <w:b/>
@@ -133,18 +165,28 @@
         </w:rPr>
         <w:t xml:space="preserve">upper }}, {{ </w:t>
       </w:r>
-      <w:r>
-        <w:rPr>
-          <w:b/>
-        </w:rPr>
-        <w:t>state_name(</w:t>
-      </w:r>
+      <w:proofErr w:type="spellStart"/>
+      <w:r>
+        <w:rPr>
+          <w:b/>
+        </w:rPr>
+        <w:t>state_name</w:t>
+      </w:r>
+      <w:proofErr w:type="spellEnd"/>
+      <w:r>
+        <w:rPr>
+          <w:b/>
+        </w:rPr>
+        <w:t>(</w:t>
+      </w:r>
+      <w:proofErr w:type="spellStart"/>
       <w:r>
         <w:rPr>
           <w:b/>
         </w:rPr>
         <w:t>dhs.court_state</w:t>
       </w:r>
+      <w:proofErr w:type="spellEnd"/>
       <w:r>
         <w:rPr>
           <w:b/>
@@ -161,8 +203,16 @@
         <w:rPr>
           <w:b/>
         </w:rPr>
-        <w:t>upper }}{% else %}{{ dhs.address.city</w:t>
-      </w:r>
+        <w:t xml:space="preserve">upper }}{% else %}{{ </w:t>
+      </w:r>
+      <w:proofErr w:type="spellStart"/>
+      <w:r>
+        <w:rPr>
+          <w:b/>
+        </w:rPr>
+        <w:t>dhs.address.city</w:t>
+      </w:r>
+      <w:proofErr w:type="spellEnd"/>
       <w:r>
         <w:rPr>
           <w:b/>
@@ -178,12 +228,21 @@
         </w:rPr>
         <w:t xml:space="preserve">upper }}, {{ </w:t>
       </w:r>
-      <w:r>
-        <w:rPr>
-          <w:b/>
-        </w:rPr>
-        <w:t>state_name(</w:t>
-      </w:r>
+      <w:proofErr w:type="spellStart"/>
+      <w:r>
+        <w:rPr>
+          <w:b/>
+        </w:rPr>
+        <w:t>state_name</w:t>
+      </w:r>
+      <w:proofErr w:type="spellEnd"/>
+      <w:r>
+        <w:rPr>
+          <w:b/>
+        </w:rPr>
+        <w:t>(</w:t>
+      </w:r>
+      <w:proofErr w:type="spellStart"/>
       <w:r>
         <w:rPr>
           <w:b/>
@@ -196,6 +255,7 @@
         </w:rPr>
         <w:t>state</w:t>
       </w:r>
+      <w:proofErr w:type="spellEnd"/>
       <w:r>
         <w:rPr>
           <w:b/>
@@ -272,6 +332,7 @@
         </w:rPr>
         <w:t xml:space="preserve"> of:</w:t>
       </w:r>
+      <w:proofErr w:type="gramStart"/>
       <w:r>
         <w:tab/>
       </w:r>
@@ -281,6 +342,7 @@
       <w:r>
         <w:t>)</w:t>
       </w:r>
+      <w:proofErr w:type="gramEnd"/>
       <w:r>
         <w:rPr>
           <w:bCs/>
@@ -338,6 +400,7 @@
         </w:rPr>
         <w:t xml:space="preserve">{%p if </w:t>
       </w:r>
+      <w:proofErr w:type="spellStart"/>
       <w:r>
         <w:rPr>
           <w:bCs/>
@@ -354,7 +417,14 @@
         <w:rPr>
           <w:bCs/>
         </w:rPr>
-        <w:t>users | length == 1</w:t>
+        <w:t>users</w:t>
+      </w:r>
+      <w:proofErr w:type="spellEnd"/>
+      <w:r>
+        <w:rPr>
+          <w:bCs/>
+        </w:rPr>
+        <w:t xml:space="preserve"> | length == 1</w:t>
       </w:r>
       <w:r>
         <w:rPr>
@@ -378,50 +448,90 @@
           <w:bCs/>
         </w:rPr>
       </w:pPr>
+      <w:proofErr w:type="gramStart"/>
       <w:r>
         <w:rPr>
           <w:bCs/>
         </w:rPr>
         <w:t xml:space="preserve">{{ </w:t>
       </w:r>
+      <w:proofErr w:type="spellStart"/>
+      <w:r>
+        <w:rPr>
+          <w:bCs/>
+        </w:rPr>
+        <w:t>motion</w:t>
+      </w:r>
+      <w:proofErr w:type="gramEnd"/>
+      <w:r>
+        <w:rPr>
+          <w:bCs/>
+        </w:rPr>
+        <w:t>_users</w:t>
+      </w:r>
+      <w:proofErr w:type="spellEnd"/>
+      <w:r>
+        <w:rPr>
+          <w:bCs/>
+        </w:rPr>
+        <w:t>[0].</w:t>
+      </w:r>
+      <w:proofErr w:type="spellStart"/>
+      <w:r>
+        <w:rPr>
+          <w:bCs/>
+        </w:rPr>
+        <w:t>name.lastfirst</w:t>
+      </w:r>
+      <w:proofErr w:type="spellEnd"/>
+      <w:r>
+        <w:rPr>
+          <w:bCs/>
+        </w:rPr>
+        <w:t>()</w:t>
+      </w:r>
+      <w:r>
+        <w:rPr>
+          <w:bCs/>
+        </w:rPr>
+        <w:t>}}</w:t>
+      </w:r>
+      <w:r>
+        <w:t xml:space="preserve"> </w:t>
+      </w:r>
+      <w:r>
+        <w:rPr>
+          <w:bCs/>
+        </w:rPr>
+        <w:t xml:space="preserve">{{ </w:t>
+      </w:r>
+      <w:proofErr w:type="spellStart"/>
       <w:r>
         <w:rPr>
           <w:bCs/>
         </w:rPr>
         <w:t>motion_users</w:t>
       </w:r>
-      <w:r>
-        <w:rPr>
-          <w:bCs/>
-        </w:rPr>
-        <w:t>[0].name.lastfirst()</w:t>
-      </w:r>
-      <w:r>
-        <w:rPr>
-          <w:bCs/>
-        </w:rPr>
-        <w:t>}}</w:t>
-      </w:r>
-      <w:r>
-        <w:t xml:space="preserve"> </w:t>
-      </w:r>
-      <w:r>
-        <w:rPr>
-          <w:bCs/>
-        </w:rPr>
-        <w:t xml:space="preserve">{{ </w:t>
-      </w:r>
-      <w:r>
-        <w:rPr>
-          <w:bCs/>
-        </w:rPr>
-        <w:t>motion_users</w:t>
-      </w:r>
-      <w:r>
-        <w:rPr>
-          <w:bCs/>
-        </w:rPr>
-        <w:t xml:space="preserve">[0].name.middle </w:t>
+      <w:proofErr w:type="spellEnd"/>
+      <w:r>
+        <w:rPr>
+          <w:bCs/>
+        </w:rPr>
+        <w:t>[0].</w:t>
+      </w:r>
+      <w:proofErr w:type="spellStart"/>
+      <w:r>
+        <w:rPr>
+          <w:bCs/>
+        </w:rPr>
+        <w:t>name.middle</w:t>
+      </w:r>
+      <w:proofErr w:type="spellEnd"/>
+      <w:r>
+        <w:rPr>
+          <w:bCs/>
+        </w:rPr>
+        <w:t xml:space="preserve"> </w:t>
       </w:r>
       <w:r>
         <w:rPr>
@@ -458,12 +568,14 @@
         </w:rPr>
         <w:t xml:space="preserve">A# {{ </w:t>
       </w:r>
+      <w:proofErr w:type="spellStart"/>
       <w:r>
         <w:rPr>
           <w:bCs/>
         </w:rPr>
         <w:t>motion_users</w:t>
       </w:r>
+      <w:proofErr w:type="spellEnd"/>
       <w:r>
         <w:rPr>
           <w:bCs/>
@@ -476,11 +588,19 @@
         </w:rPr>
         <w:t>].</w:t>
       </w:r>
-      <w:r>
-        <w:rPr>
-          <w:bCs/>
-        </w:rPr>
-        <w:t>a_number }}</w:t>
+      <w:proofErr w:type="spellStart"/>
+      <w:r>
+        <w:rPr>
+          <w:bCs/>
+        </w:rPr>
+        <w:t>a_number</w:t>
+      </w:r>
+      <w:proofErr w:type="spellEnd"/>
+      <w:r>
+        <w:rPr>
+          <w:bCs/>
+        </w:rPr>
+        <w:t xml:space="preserve"> }}</w:t>
       </w:r>
     </w:p>
     <w:p>
@@ -568,12 +688,14 @@
         </w:rPr>
         <w:t xml:space="preserve">{%p for x in </w:t>
       </w:r>
+      <w:proofErr w:type="spellStart"/>
       <w:r>
         <w:rPr>
           <w:bCs/>
         </w:rPr>
         <w:t>motion_users</w:t>
       </w:r>
+      <w:proofErr w:type="spellEnd"/>
       <w:r>
         <w:rPr>
           <w:bCs/>
@@ -596,18 +718,22 @@
         </w:rPr>
         <w:t>{{</w:t>
       </w:r>
+      <w:proofErr w:type="spellStart"/>
       <w:r>
         <w:rPr>
           <w:bCs/>
         </w:rPr>
         <w:t>x.</w:t>
       </w:r>
+      <w:proofErr w:type="gramStart"/>
       <w:r>
         <w:rPr>
           <w:bCs/>
         </w:rPr>
         <w:t>name.lastfirst</w:t>
       </w:r>
+      <w:proofErr w:type="spellEnd"/>
+      <w:proofErr w:type="gramEnd"/>
       <w:r>
         <w:rPr>
           <w:bCs/>
@@ -626,6 +752,7 @@
         </w:rPr>
         <w:t>}} {{</w:t>
       </w:r>
+      <w:proofErr w:type="spellStart"/>
       <w:r>
         <w:rPr>
           <w:bCs/>
@@ -638,6 +765,7 @@
         </w:rPr>
         <w:t>.name.middle</w:t>
       </w:r>
+      <w:proofErr w:type="spellEnd"/>
       <w:r>
         <w:rPr>
           <w:bCs/>
@@ -677,7 +805,14 @@
         <w:rPr>
           <w:bCs/>
         </w:rPr>
-        <w:t xml:space="preserve"> x</w:t>
+        <w:t xml:space="preserve"> </w:t>
+      </w:r>
+      <w:proofErr w:type="spellStart"/>
+      <w:r>
+        <w:rPr>
+          <w:bCs/>
+        </w:rPr>
+        <w:t>x</w:t>
       </w:r>
       <w:r>
         <w:rPr>
@@ -689,7 +824,14 @@
         <w:rPr>
           <w:bCs/>
         </w:rPr>
-        <w:t>a_number }}</w:t>
+        <w:t>a_number</w:t>
+      </w:r>
+      <w:proofErr w:type="spellEnd"/>
+      <w:r>
+        <w:rPr>
+          <w:bCs/>
+        </w:rPr>
+        <w:t xml:space="preserve"> }}</w:t>
       </w:r>
     </w:p>
     <w:p>
@@ -705,7 +847,21 @@
         <w:rPr>
           <w:bCs/>
         </w:rPr>
-        <w:t>{%p endfor %}</w:t>
+        <w:t xml:space="preserve">{%p </w:t>
+      </w:r>
+      <w:proofErr w:type="spellStart"/>
+      <w:r>
+        <w:rPr>
+          <w:bCs/>
+        </w:rPr>
+        <w:t>endfor</w:t>
+      </w:r>
+      <w:proofErr w:type="spellEnd"/>
+      <w:r>
+        <w:rPr>
+          <w:bCs/>
+        </w:rPr>
+        <w:t xml:space="preserve"> %}</w:t>
       </w:r>
     </w:p>
     <w:p>
@@ -792,12 +948,14 @@
           <w:tab w:val="left" w:pos="5220"/>
         </w:tabs>
       </w:pPr>
+      <w:proofErr w:type="gramStart"/>
       <w:r>
         <w:t>{</w:t>
       </w:r>
       <w:r>
         <w:t xml:space="preserve">{ </w:t>
       </w:r>
+      <w:proofErr w:type="spellStart"/>
       <w:r>
         <w:t>immigration_judge.</w:t>
       </w:r>
@@ -807,6 +965,7 @@
         </w:rPr>
         <w:t>name</w:t>
       </w:r>
+      <w:proofErr w:type="gramEnd"/>
       <w:r>
         <w:rPr>
           <w:bCs/>
@@ -819,6 +978,7 @@
         </w:rPr>
         <w:t>full</w:t>
       </w:r>
+      <w:proofErr w:type="spellEnd"/>
       <w:r>
         <w:rPr>
           <w:bCs/>
@@ -852,11 +1012,24 @@
       <w:r>
         <w:t xml:space="preserve">{ </w:t>
       </w:r>
+      <w:proofErr w:type="spellStart"/>
       <w:r>
         <w:t>hearing_datetime</w:t>
       </w:r>
       <w:r>
-        <w:t>.format(“MM/dd/yyyy”)</w:t>
+        <w:t>.format</w:t>
+      </w:r>
+      <w:proofErr w:type="spellEnd"/>
+      <w:r>
+        <w:t>(“MM/dd/</w:t>
+      </w:r>
+      <w:proofErr w:type="spellStart"/>
+      <w:r>
+        <w:t>yyyy</w:t>
+      </w:r>
+      <w:proofErr w:type="spellEnd"/>
+      <w:r>
+        <w:t>”)</w:t>
       </w:r>
       <w:r>
         <w:t xml:space="preserve"> </w:t>
@@ -1041,8 +1214,38 @@
         <w:rPr>
           <w:b/>
         </w:rPr>
-        <w:t>{% if dhs.different_court_location %}{{ dhs.court_city</w:t>
-      </w:r>
+        <w:t xml:space="preserve">{% if </w:t>
+      </w:r>
+      <w:proofErr w:type="spellStart"/>
+      <w:proofErr w:type="gramStart"/>
+      <w:r>
+        <w:rPr>
+          <w:b/>
+        </w:rPr>
+        <w:t>dhs.different</w:t>
+      </w:r>
+      <w:proofErr w:type="gramEnd"/>
+      <w:r>
+        <w:rPr>
+          <w:b/>
+        </w:rPr>
+        <w:t>_court_location</w:t>
+      </w:r>
+      <w:proofErr w:type="spellEnd"/>
+      <w:r>
+        <w:rPr>
+          <w:b/>
+        </w:rPr>
+        <w:t xml:space="preserve"> %}{{ </w:t>
+      </w:r>
+      <w:proofErr w:type="spellStart"/>
+      <w:r>
+        <w:rPr>
+          <w:b/>
+        </w:rPr>
+        <w:t>dhs.court_city</w:t>
+      </w:r>
+      <w:proofErr w:type="spellEnd"/>
       <w:r>
         <w:rPr>
           <w:b/>
@@ -1055,18 +1258,28 @@
         </w:rPr>
         <w:t xml:space="preserve">upper }}, {{ </w:t>
       </w:r>
-      <w:r>
-        <w:rPr>
-          <w:b/>
-        </w:rPr>
-        <w:t>state_name(</w:t>
-      </w:r>
+      <w:proofErr w:type="spellStart"/>
+      <w:r>
+        <w:rPr>
+          <w:b/>
+        </w:rPr>
+        <w:t>state_name</w:t>
+      </w:r>
+      <w:proofErr w:type="spellEnd"/>
+      <w:r>
+        <w:rPr>
+          <w:b/>
+        </w:rPr>
+        <w:t>(</w:t>
+      </w:r>
+      <w:proofErr w:type="spellStart"/>
       <w:r>
         <w:rPr>
           <w:b/>
         </w:rPr>
         <w:t>dhs.court_state</w:t>
       </w:r>
+      <w:proofErr w:type="spellEnd"/>
       <w:r>
         <w:rPr>
           <w:b/>
@@ -1077,8 +1290,16 @@
         <w:rPr>
           <w:b/>
         </w:rPr>
-        <w:t>upper }}{% else %}{{ dhs.address.city</w:t>
-      </w:r>
+        <w:t xml:space="preserve">upper }}{% else %}{{ </w:t>
+      </w:r>
+      <w:proofErr w:type="spellStart"/>
+      <w:r>
+        <w:rPr>
+          <w:b/>
+        </w:rPr>
+        <w:t>dhs.address.city</w:t>
+      </w:r>
+      <w:proofErr w:type="spellEnd"/>
       <w:r>
         <w:rPr>
           <w:b/>
@@ -1094,12 +1315,21 @@
         </w:rPr>
         <w:t xml:space="preserve">upper }}, {{ </w:t>
       </w:r>
-      <w:r>
-        <w:rPr>
-          <w:b/>
-        </w:rPr>
-        <w:t>state_name(</w:t>
-      </w:r>
+      <w:proofErr w:type="spellStart"/>
+      <w:r>
+        <w:rPr>
+          <w:b/>
+        </w:rPr>
+        <w:t>state_name</w:t>
+      </w:r>
+      <w:proofErr w:type="spellEnd"/>
+      <w:r>
+        <w:rPr>
+          <w:b/>
+        </w:rPr>
+        <w:t>(</w:t>
+      </w:r>
+      <w:proofErr w:type="spellStart"/>
       <w:r>
         <w:rPr>
           <w:b/>
@@ -1110,7 +1340,14 @@
         <w:rPr>
           <w:b/>
         </w:rPr>
-        <w:t xml:space="preserve">state) | </w:t>
+        <w:t>state</w:t>
+      </w:r>
+      <w:proofErr w:type="spellEnd"/>
+      <w:r>
+        <w:rPr>
+          <w:b/>
+        </w:rPr>
+        <w:t xml:space="preserve">) | </w:t>
       </w:r>
       <w:r>
         <w:rPr>
@@ -1134,12 +1371,14 @@
         </w:rPr>
         <w:t xml:space="preserve">{{ </w:t>
       </w:r>
+      <w:proofErr w:type="spellStart"/>
       <w:r>
         <w:rPr>
           <w:bCs/>
         </w:rPr>
         <w:t>motion_users</w:t>
       </w:r>
+      <w:proofErr w:type="spellEnd"/>
       <w:r>
         <w:rPr>
           <w:bCs/>
@@ -1158,6 +1397,7 @@
         </w:rPr>
         <w:t>].</w:t>
       </w:r>
+      <w:proofErr w:type="spellStart"/>
       <w:r>
         <w:rPr>
           <w:bCs/>
@@ -1176,6 +1416,7 @@
         </w:rPr>
         <w:t>full</w:t>
       </w:r>
+      <w:proofErr w:type="spellEnd"/>
       <w:r>
         <w:rPr>
           <w:bCs/>
@@ -1213,7 +1454,14 @@
         <w:rPr>
           <w:bCs/>
         </w:rPr>
-        <w:t>{% if dhs.</w:t>
+        <w:t xml:space="preserve">{% if </w:t>
+      </w:r>
+      <w:proofErr w:type="spellStart"/>
+      <w:r>
+        <w:rPr>
+          <w:bCs/>
+        </w:rPr>
+        <w:t>dhs.</w:t>
       </w:r>
       <w:r>
         <w:rPr>
@@ -1221,6 +1469,7 @@
         </w:rPr>
         <w:t>different_court_location</w:t>
       </w:r>
+      <w:proofErr w:type="spellEnd"/>
       <w:r>
         <w:rPr>
           <w:bCs/>
@@ -1233,6 +1482,7 @@
         </w:rPr>
         <w:t xml:space="preserve"> </w:t>
       </w:r>
+      <w:proofErr w:type="spellStart"/>
       <w:r>
         <w:rPr>
           <w:bCs/>
@@ -1251,6 +1501,7 @@
         </w:rPr>
         <w:t>court_city</w:t>
       </w:r>
+      <w:proofErr w:type="spellEnd"/>
       <w:r>
         <w:rPr>
           <w:bCs/>
@@ -1269,6 +1520,7 @@
         </w:rPr>
         <w:t xml:space="preserve">{{ </w:t>
       </w:r>
+      <w:proofErr w:type="spellStart"/>
       <w:r>
         <w:rPr>
           <w:bCs/>
@@ -1287,6 +1539,7 @@
         </w:rPr>
         <w:t>court_state</w:t>
       </w:r>
+      <w:proofErr w:type="spellEnd"/>
       <w:r>
         <w:rPr>
           <w:bCs/>
@@ -1305,6 +1558,7 @@
         </w:rPr>
         <w:t xml:space="preserve"> </w:t>
       </w:r>
+      <w:proofErr w:type="spellStart"/>
       <w:r>
         <w:rPr>
           <w:bCs/>
@@ -1327,7 +1581,14 @@
         <w:rPr>
           <w:bCs/>
         </w:rPr>
-        <w:t>city }},</w:t>
+        <w:t>city</w:t>
+      </w:r>
+      <w:proofErr w:type="spellEnd"/>
+      <w:r>
+        <w:rPr>
+          <w:bCs/>
+        </w:rPr>
+        <w:t xml:space="preserve"> }},</w:t>
       </w:r>
       <w:r>
         <w:rPr>
@@ -1341,6 +1602,7 @@
         </w:rPr>
         <w:t xml:space="preserve">{{ </w:t>
       </w:r>
+      <w:proofErr w:type="spellStart"/>
       <w:r>
         <w:rPr>
           <w:bCs/>
@@ -1363,7 +1625,14 @@
         <w:rPr>
           <w:bCs/>
         </w:rPr>
-        <w:t>state }}</w:t>
+        <w:t>state</w:t>
+      </w:r>
+      <w:proofErr w:type="spellEnd"/>
+      <w:r>
+        <w:rPr>
+          <w:bCs/>
+        </w:rPr>
+        <w:t xml:space="preserve"> }}</w:t>
       </w:r>
       <w:r>
         <w:t xml:space="preserve">{% endif %} to the immigration court in Chicago, IL. </w:t>
@@ -1398,18 +1667,28 @@
       <w:r>
         <w:t xml:space="preserve">I currently reside at </w:t>
       </w:r>
+      <w:proofErr w:type="gramStart"/>
       <w:r>
         <w:rPr>
           <w:bCs/>
         </w:rPr>
         <w:t xml:space="preserve">{{ </w:t>
       </w:r>
-      <w:r>
-        <w:rPr>
-          <w:bCs/>
-        </w:rPr>
-        <w:t>motion_users</w:t>
-      </w:r>
+      <w:proofErr w:type="spellStart"/>
+      <w:r>
+        <w:rPr>
+          <w:bCs/>
+        </w:rPr>
+        <w:t>motion</w:t>
+      </w:r>
+      <w:proofErr w:type="gramEnd"/>
+      <w:r>
+        <w:rPr>
+          <w:bCs/>
+        </w:rPr>
+        <w:t>_users</w:t>
+      </w:r>
+      <w:proofErr w:type="spellEnd"/>
       <w:r>
         <w:rPr>
           <w:bCs/>
@@ -1428,11 +1707,19 @@
         </w:rPr>
         <w:t>].</w:t>
       </w:r>
-      <w:r>
-        <w:rPr>
-          <w:bCs/>
-        </w:rPr>
-        <w:t xml:space="preserve">address.on_one_line(bare=True) </w:t>
+      <w:proofErr w:type="spellStart"/>
+      <w:r>
+        <w:rPr>
+          <w:bCs/>
+        </w:rPr>
+        <w:t>address.on_one_line</w:t>
+      </w:r>
+      <w:proofErr w:type="spellEnd"/>
+      <w:r>
+        <w:rPr>
+          <w:bCs/>
+        </w:rPr>
+        <w:t xml:space="preserve">(bare=True) </w:t>
       </w:r>
       <w:r>
         <w:rPr>
@@ -1443,6 +1730,7 @@
       <w:r>
         <w:t xml:space="preserve">. I have been in the United States since </w:t>
       </w:r>
+      <w:proofErr w:type="gramStart"/>
       <w:r>
         <w:t>{{</w:t>
       </w:r>
@@ -1455,11 +1743,20 @@
         </w:rPr>
         <w:t xml:space="preserve"> </w:t>
       </w:r>
-      <w:r>
-        <w:t>entry_to_us_date</w:t>
-      </w:r>
-      <w:r>
-        <w:t>.format("M</w:t>
+      <w:proofErr w:type="spellStart"/>
+      <w:r>
+        <w:t>entry</w:t>
+      </w:r>
+      <w:proofErr w:type="gramEnd"/>
+      <w:r>
+        <w:t>_to_us_date</w:t>
+      </w:r>
+      <w:r>
+        <w:t>.format</w:t>
+      </w:r>
+      <w:proofErr w:type="spellEnd"/>
+      <w:r>
+        <w:t>("M</w:t>
       </w:r>
       <w:r>
         <w:t>MM</w:t>
@@ -1476,8 +1773,13 @@
       <w:r>
         <w:t xml:space="preserve">, </w:t>
       </w:r>
-      <w:r>
-        <w:t>yyyy") }}</w:t>
+      <w:proofErr w:type="spellStart"/>
+      <w:r>
+        <w:t>yyyy</w:t>
+      </w:r>
+      <w:proofErr w:type="spellEnd"/>
+      <w:r>
+        <w:t>") }}</w:t>
       </w:r>
       <w:r>
         <w:t xml:space="preserve"> </w:t>
@@ -1488,11 +1790,16 @@
       <w:r>
         <w:t xml:space="preserve">{{ </w:t>
       </w:r>
+      <w:proofErr w:type="spellStart"/>
       <w:r>
         <w:t>illinois_move_date</w:t>
       </w:r>
       <w:r>
-        <w:t>.format('MM</w:t>
+        <w:t>.format</w:t>
+      </w:r>
+      <w:proofErr w:type="spellEnd"/>
+      <w:r>
+        <w:t>('MM</w:t>
       </w:r>
       <w:r>
         <w:t xml:space="preserve">MM </w:t>
@@ -1503,8 +1810,13 @@
       <w:r>
         <w:t xml:space="preserve">, </w:t>
       </w:r>
-      <w:r>
-        <w:t>yyyy') }}</w:t>
+      <w:proofErr w:type="spellStart"/>
+      <w:r>
+        <w:t>yyyy</w:t>
+      </w:r>
+      <w:proofErr w:type="spellEnd"/>
+      <w:r>
+        <w:t>') }}</w:t>
       </w:r>
       <w:r>
         <w:t>.</w:t>
@@ -1526,14 +1838,30 @@
         <w:rPr>
           <w:bCs/>
         </w:rPr>
-        <w:t>{% if dhs.</w:t>
-      </w:r>
-      <w:r>
-        <w:rPr>
-          <w:bCs/>
-        </w:rPr>
-        <w:t>different_court_location</w:t>
-      </w:r>
+        <w:t xml:space="preserve">{% if </w:t>
+      </w:r>
+      <w:proofErr w:type="spellStart"/>
+      <w:proofErr w:type="gramStart"/>
+      <w:r>
+        <w:rPr>
+          <w:bCs/>
+        </w:rPr>
+        <w:t>dhs.</w:t>
+      </w:r>
+      <w:r>
+        <w:rPr>
+          <w:bCs/>
+        </w:rPr>
+        <w:t>different</w:t>
+      </w:r>
+      <w:proofErr w:type="gramEnd"/>
+      <w:r>
+        <w:rPr>
+          <w:bCs/>
+        </w:rPr>
+        <w:t>_court_location</w:t>
+      </w:r>
+      <w:proofErr w:type="spellEnd"/>
       <w:r>
         <w:rPr>
           <w:bCs/>
@@ -1546,6 +1874,7 @@
         </w:rPr>
         <w:t xml:space="preserve"> </w:t>
       </w:r>
+      <w:proofErr w:type="spellStart"/>
       <w:r>
         <w:rPr>
           <w:bCs/>
@@ -1564,6 +1893,7 @@
         </w:rPr>
         <w:t>court_city</w:t>
       </w:r>
+      <w:proofErr w:type="spellEnd"/>
       <w:r>
         <w:rPr>
           <w:bCs/>
@@ -1582,6 +1912,7 @@
         </w:rPr>
         <w:t xml:space="preserve">{{ </w:t>
       </w:r>
+      <w:proofErr w:type="spellStart"/>
       <w:r>
         <w:rPr>
           <w:bCs/>
@@ -1600,6 +1931,7 @@
         </w:rPr>
         <w:t>court_state</w:t>
       </w:r>
+      <w:proofErr w:type="spellEnd"/>
       <w:r>
         <w:rPr>
           <w:bCs/>
@@ -1618,6 +1950,7 @@
         </w:rPr>
         <w:t xml:space="preserve"> </w:t>
       </w:r>
+      <w:proofErr w:type="spellStart"/>
       <w:r>
         <w:rPr>
           <w:bCs/>
@@ -1640,7 +1973,14 @@
         <w:rPr>
           <w:bCs/>
         </w:rPr>
-        <w:t>city }},</w:t>
+        <w:t>city</w:t>
+      </w:r>
+      <w:proofErr w:type="spellEnd"/>
+      <w:r>
+        <w:rPr>
+          <w:bCs/>
+        </w:rPr>
+        <w:t xml:space="preserve"> }},</w:t>
       </w:r>
       <w:r>
         <w:rPr>
@@ -1654,6 +1994,7 @@
         </w:rPr>
         <w:t xml:space="preserve">{{ </w:t>
       </w:r>
+      <w:proofErr w:type="spellStart"/>
       <w:r>
         <w:rPr>
           <w:bCs/>
@@ -1676,7 +2017,14 @@
         <w:rPr>
           <w:bCs/>
         </w:rPr>
-        <w:t>state }}</w:t>
+        <w:t>state</w:t>
+      </w:r>
+      <w:proofErr w:type="spellEnd"/>
+      <w:r>
+        <w:rPr>
+          <w:bCs/>
+        </w:rPr>
+        <w:t xml:space="preserve"> }}</w:t>
       </w:r>
       <w:r>
         <w:t>{% endif %}</w:t>
@@ -1714,11 +2062,16 @@
       <w:r>
         <w:t xml:space="preserve">As of today, </w:t>
       </w:r>
+      <w:proofErr w:type="gramStart"/>
       <w:r>
         <w:t>{{</w:t>
       </w:r>
       <w:r>
-        <w:t xml:space="preserve"> today()</w:t>
+        <w:t xml:space="preserve"> today</w:t>
+      </w:r>
+      <w:proofErr w:type="gramEnd"/>
+      <w:r>
+        <w:t>()</w:t>
       </w:r>
       <w:r>
         <w:t>.format('MM</w:t>
@@ -1732,8 +2085,13 @@
       <w:r>
         <w:t xml:space="preserve">, </w:t>
       </w:r>
-      <w:r>
-        <w:t>yyyy') }}</w:t>
+      <w:proofErr w:type="spellStart"/>
+      <w:r>
+        <w:t>yyyy</w:t>
+      </w:r>
+      <w:proofErr w:type="spellEnd"/>
+      <w:r>
+        <w:t>') }}</w:t>
       </w:r>
       <w:r>
         <w:t xml:space="preserve">, I have not appeared before an immigration judge and I have not submitted pleadings for my Notice to Appear. </w:t>
@@ -1746,157 +2104,20 @@
           <w:numId w:val="9"/>
         </w:numPr>
         <w:spacing w:line="360" w:lineRule="auto"/>
+      </w:pPr>
+      <w:r>
         <w:rPr>
           <w:sz w:val="23"/>
           <w:szCs w:val="23"/>
         </w:rPr>
-      </w:pPr>
+        <w:t>Give</w:t>
+      </w:r>
       <w:r>
         <w:rPr>
           <w:sz w:val="23"/>
           <w:szCs w:val="23"/>
         </w:rPr>
-        <w:t>I enter Pleadings as follows in response to Notice to Appear dated</w:t>
-      </w:r>
-      <w:r>
-        <w:rPr>
-          <w:sz w:val="23"/>
-          <w:szCs w:val="23"/>
-        </w:rPr>
-        <w:t xml:space="preserve"> </w:t>
-      </w:r>
-      <w:r>
-        <w:t>{</w:t>
-      </w:r>
-      <w:r>
-        <w:t xml:space="preserve">{ </w:t>
-      </w:r>
-      <w:r>
-        <w:t>notice_appear_date</w:t>
-      </w:r>
-      <w:r>
-        <w:t>.format(“M</w:t>
-      </w:r>
-      <w:r>
-        <w:t>MM</w:t>
-      </w:r>
-      <w:r>
-        <w:t>M</w:t>
-      </w:r>
-      <w:r>
-        <w:t xml:space="preserve"> </w:t>
-      </w:r>
-      <w:r>
-        <w:t>d</w:t>
-      </w:r>
-      <w:r>
-        <w:t xml:space="preserve">, </w:t>
-      </w:r>
-      <w:r>
-        <w:t>yyyy”)</w:t>
-      </w:r>
-      <w:r>
-        <w:t xml:space="preserve"> </w:t>
-      </w:r>
-      <w:r>
-        <w:t>}}</w:t>
-      </w:r>
-    </w:p>
-    <w:p>
-      <w:pPr>
-        <w:shd w:val="clear" w:color="auto" w:fill="FFFFFF"/>
-        <w:spacing w:before="20" w:line="360" w:lineRule="auto"/>
-        <w:ind w:left="720" w:firstLine="720"/>
-        <w:jc w:val="both"/>
-        <w:rPr>
-          <w:sz w:val="23"/>
-          <w:szCs w:val="23"/>
-        </w:rPr>
-      </w:pPr>
-      <w:r>
-        <w:rPr>
-          <w:sz w:val="23"/>
-          <w:szCs w:val="23"/>
-        </w:rPr>
-        <w:t xml:space="preserve">I admit the allegations in the Notice to Appear.  </w:t>
-      </w:r>
-    </w:p>
-    <w:p>
-      <w:pPr>
-        <w:shd w:val="clear" w:color="auto" w:fill="FFFFFF"/>
-        <w:spacing w:before="20" w:line="360" w:lineRule="auto"/>
-        <w:ind w:left="720" w:firstLine="720"/>
-        <w:jc w:val="both"/>
-        <w:rPr>
-          <w:sz w:val="23"/>
-          <w:szCs w:val="23"/>
-        </w:rPr>
-      </w:pPr>
-      <w:r>
-        <w:rPr>
-          <w:sz w:val="23"/>
-          <w:szCs w:val="23"/>
-        </w:rPr>
-        <w:t xml:space="preserve">I concede removability. </w:t>
-      </w:r>
-    </w:p>
-    <w:p>
-      <w:pPr>
-        <w:shd w:val="clear" w:color="auto" w:fill="FFFFFF"/>
-        <w:spacing w:line="360" w:lineRule="auto"/>
-        <w:ind w:left="720" w:firstLine="720"/>
-        <w:jc w:val="both"/>
-      </w:pPr>
-      <w:r>
-        <w:rPr>
-          <w:sz w:val="23"/>
-          <w:szCs w:val="23"/>
-        </w:rPr>
-        <w:t>I decline to designate a country of removal.</w:t>
-      </w:r>
-      <w:r>
-        <w:t xml:space="preserve">  </w:t>
-      </w:r>
-    </w:p>
-    <w:p>
-      <w:pPr>
-        <w:shd w:val="clear" w:color="auto" w:fill="FFFFFF"/>
-        <w:spacing w:line="360" w:lineRule="auto"/>
-        <w:ind w:left="720" w:firstLine="720"/>
-        <w:jc w:val="both"/>
-      </w:pPr>
-      <w:r>
-        <w:t>I will be seeking</w:t>
-      </w:r>
-      <w:r>
-        <w:t xml:space="preserve"> </w:t>
-      </w:r>
-      <w:r>
-        <w:rPr>
-          <w:bCs/>
-        </w:rPr>
-        <w:t>{{</w:t>
-      </w:r>
-      <w:r>
-        <w:rPr>
-          <w:bCs/>
-        </w:rPr>
-        <w:t xml:space="preserve"> </w:t>
-      </w:r>
-      <w:r>
-        <w:rPr>
-          <w:bCs/>
-        </w:rPr>
-        <w:t>type_of_relief</w:t>
-      </w:r>
-      <w:r>
-        <w:rPr>
-          <w:bCs/>
-        </w:rPr>
-        <w:t xml:space="preserve"> }}</w:t>
-      </w:r>
-      <w:r>
-        <w:t>.</w:t>
+        <w:t>n the Immigration Court Practice Manual does not require pleadings for motions to change venue, I am omitting pleadings from this motion because I would like to discuss the case with an attorney before entering pleadings. See ICPM Chap. 5.10(c).</w:t>
       </w:r>
     </w:p>
     <w:p>
@@ -2054,8 +2275,38 @@
         <w:rPr>
           <w:b/>
         </w:rPr>
-        <w:t>{% if dhs.different_court_location %}{{ dhs.court_city</w:t>
-      </w:r>
+        <w:t xml:space="preserve">{% if </w:t>
+      </w:r>
+      <w:proofErr w:type="spellStart"/>
+      <w:proofErr w:type="gramStart"/>
+      <w:r>
+        <w:rPr>
+          <w:b/>
+        </w:rPr>
+        <w:t>dhs.different</w:t>
+      </w:r>
+      <w:proofErr w:type="gramEnd"/>
+      <w:r>
+        <w:rPr>
+          <w:b/>
+        </w:rPr>
+        <w:t>_court_location</w:t>
+      </w:r>
+      <w:proofErr w:type="spellEnd"/>
+      <w:r>
+        <w:rPr>
+          <w:b/>
+        </w:rPr>
+        <w:t xml:space="preserve"> %}{{ </w:t>
+      </w:r>
+      <w:proofErr w:type="spellStart"/>
+      <w:r>
+        <w:rPr>
+          <w:b/>
+        </w:rPr>
+        <w:t>dhs.court_city</w:t>
+      </w:r>
+      <w:proofErr w:type="spellEnd"/>
       <w:r>
         <w:rPr>
           <w:b/>
@@ -2068,18 +2319,28 @@
         </w:rPr>
         <w:t xml:space="preserve">upper }}, {{ </w:t>
       </w:r>
-      <w:r>
-        <w:rPr>
-          <w:b/>
-        </w:rPr>
-        <w:t>state_name(</w:t>
-      </w:r>
+      <w:proofErr w:type="spellStart"/>
+      <w:r>
+        <w:rPr>
+          <w:b/>
+        </w:rPr>
+        <w:t>state_name</w:t>
+      </w:r>
+      <w:proofErr w:type="spellEnd"/>
+      <w:r>
+        <w:rPr>
+          <w:b/>
+        </w:rPr>
+        <w:t>(</w:t>
+      </w:r>
+      <w:proofErr w:type="spellStart"/>
       <w:r>
         <w:rPr>
           <w:b/>
         </w:rPr>
         <w:t>dhs.court_state</w:t>
       </w:r>
+      <w:proofErr w:type="spellEnd"/>
       <w:r>
         <w:rPr>
           <w:b/>
@@ -2090,8 +2351,16 @@
         <w:rPr>
           <w:b/>
         </w:rPr>
-        <w:t>upper }}{% else %}{{ dhs.address.city</w:t>
-      </w:r>
+        <w:t xml:space="preserve">upper }}{% else %}{{ </w:t>
+      </w:r>
+      <w:proofErr w:type="spellStart"/>
+      <w:r>
+        <w:rPr>
+          <w:b/>
+        </w:rPr>
+        <w:t>dhs.address.city</w:t>
+      </w:r>
+      <w:proofErr w:type="spellEnd"/>
       <w:r>
         <w:rPr>
           <w:b/>
@@ -2107,12 +2376,21 @@
         </w:rPr>
         <w:t xml:space="preserve">upper }}, {{ </w:t>
       </w:r>
-      <w:r>
-        <w:rPr>
-          <w:b/>
-        </w:rPr>
-        <w:t>state_name(</w:t>
-      </w:r>
+      <w:proofErr w:type="spellStart"/>
+      <w:r>
+        <w:rPr>
+          <w:b/>
+        </w:rPr>
+        <w:t>state_name</w:t>
+      </w:r>
+      <w:proofErr w:type="spellEnd"/>
+      <w:r>
+        <w:rPr>
+          <w:b/>
+        </w:rPr>
+        <w:t>(</w:t>
+      </w:r>
+      <w:proofErr w:type="spellStart"/>
       <w:r>
         <w:rPr>
           <w:b/>
@@ -2123,7 +2401,14 @@
         <w:rPr>
           <w:b/>
         </w:rPr>
-        <w:t xml:space="preserve">state) | </w:t>
+        <w:t>state</w:t>
+      </w:r>
+      <w:proofErr w:type="spellEnd"/>
+      <w:r>
+        <w:rPr>
+          <w:b/>
+        </w:rPr>
+        <w:t xml:space="preserve">) | </w:t>
       </w:r>
       <w:r>
         <w:rPr>
@@ -2183,6 +2468,7 @@
         </w:rPr>
         <w:t xml:space="preserve">{%p if </w:t>
       </w:r>
+      <w:proofErr w:type="spellStart"/>
       <w:r>
         <w:rPr>
           <w:bCs/>
@@ -2193,7 +2479,14 @@
         <w:rPr>
           <w:bCs/>
         </w:rPr>
-        <w:t xml:space="preserve">_users </w:t>
+        <w:t>_users</w:t>
+      </w:r>
+      <w:proofErr w:type="spellEnd"/>
+      <w:r>
+        <w:rPr>
+          <w:bCs/>
+        </w:rPr>
+        <w:t xml:space="preserve"> </w:t>
       </w:r>
       <w:r>
         <w:rPr>
@@ -2211,50 +2504,90 @@
           <w:bCs/>
         </w:rPr>
       </w:pPr>
+      <w:proofErr w:type="gramStart"/>
       <w:r>
         <w:rPr>
           <w:bCs/>
         </w:rPr>
         <w:t xml:space="preserve">{{ </w:t>
       </w:r>
+      <w:proofErr w:type="spellStart"/>
+      <w:r>
+        <w:rPr>
+          <w:bCs/>
+        </w:rPr>
+        <w:t>motion</w:t>
+      </w:r>
+      <w:proofErr w:type="gramEnd"/>
+      <w:r>
+        <w:rPr>
+          <w:bCs/>
+        </w:rPr>
+        <w:t>_users</w:t>
+      </w:r>
+      <w:proofErr w:type="spellEnd"/>
+      <w:r>
+        <w:rPr>
+          <w:bCs/>
+        </w:rPr>
+        <w:t>[0].</w:t>
+      </w:r>
+      <w:proofErr w:type="spellStart"/>
+      <w:r>
+        <w:rPr>
+          <w:bCs/>
+        </w:rPr>
+        <w:t>name.lastfirst</w:t>
+      </w:r>
+      <w:proofErr w:type="spellEnd"/>
+      <w:r>
+        <w:rPr>
+          <w:bCs/>
+        </w:rPr>
+        <w:t>()</w:t>
+      </w:r>
+      <w:r>
+        <w:rPr>
+          <w:bCs/>
+        </w:rPr>
+        <w:t>}}</w:t>
+      </w:r>
+      <w:r>
+        <w:t xml:space="preserve"> </w:t>
+      </w:r>
+      <w:r>
+        <w:rPr>
+          <w:bCs/>
+        </w:rPr>
+        <w:t xml:space="preserve">{{ </w:t>
+      </w:r>
+      <w:proofErr w:type="spellStart"/>
       <w:r>
         <w:rPr>
           <w:bCs/>
         </w:rPr>
         <w:t>motion_users</w:t>
       </w:r>
-      <w:r>
-        <w:rPr>
-          <w:bCs/>
-        </w:rPr>
-        <w:t>[0].name.lastfirst()</w:t>
-      </w:r>
-      <w:r>
-        <w:rPr>
-          <w:bCs/>
-        </w:rPr>
-        <w:t>}}</w:t>
-      </w:r>
-      <w:r>
-        <w:t xml:space="preserve"> </w:t>
-      </w:r>
-      <w:r>
-        <w:rPr>
-          <w:bCs/>
-        </w:rPr>
-        <w:t xml:space="preserve">{{ </w:t>
-      </w:r>
-      <w:r>
-        <w:rPr>
-          <w:bCs/>
-        </w:rPr>
-        <w:t>motion_users</w:t>
-      </w:r>
-      <w:r>
-        <w:rPr>
-          <w:bCs/>
-        </w:rPr>
-        <w:t xml:space="preserve">[0].name.middle </w:t>
+      <w:proofErr w:type="spellEnd"/>
+      <w:r>
+        <w:rPr>
+          <w:bCs/>
+        </w:rPr>
+        <w:t>[0].</w:t>
+      </w:r>
+      <w:proofErr w:type="spellStart"/>
+      <w:r>
+        <w:rPr>
+          <w:bCs/>
+        </w:rPr>
+        <w:t>name.middle</w:t>
+      </w:r>
+      <w:proofErr w:type="spellEnd"/>
+      <w:r>
+        <w:rPr>
+          <w:bCs/>
+        </w:rPr>
+        <w:t xml:space="preserve"> </w:t>
       </w:r>
       <w:r>
         <w:rPr>
@@ -2288,12 +2621,14 @@
         </w:rPr>
         <w:t xml:space="preserve">A# {{ </w:t>
       </w:r>
+      <w:proofErr w:type="spellStart"/>
       <w:r>
         <w:rPr>
           <w:bCs/>
         </w:rPr>
         <w:t>motion_users</w:t>
       </w:r>
+      <w:proofErr w:type="spellEnd"/>
       <w:r>
         <w:rPr>
           <w:bCs/>
@@ -2312,11 +2647,19 @@
         </w:rPr>
         <w:t>].</w:t>
       </w:r>
-      <w:r>
-        <w:rPr>
-          <w:bCs/>
-        </w:rPr>
-        <w:t>a_number }}</w:t>
+      <w:proofErr w:type="spellStart"/>
+      <w:r>
+        <w:rPr>
+          <w:bCs/>
+        </w:rPr>
+        <w:t>a_number</w:t>
+      </w:r>
+      <w:proofErr w:type="spellEnd"/>
+      <w:r>
+        <w:rPr>
+          <w:bCs/>
+        </w:rPr>
+        <w:t xml:space="preserve"> }}</w:t>
       </w:r>
     </w:p>
     <w:p>
@@ -2383,12 +2726,14 @@
         </w:rPr>
         <w:t xml:space="preserve">{%p for x in </w:t>
       </w:r>
+      <w:proofErr w:type="spellStart"/>
       <w:r>
         <w:rPr>
           <w:bCs/>
         </w:rPr>
         <w:t>motion_users</w:t>
       </w:r>
+      <w:proofErr w:type="spellEnd"/>
       <w:r>
         <w:rPr>
           <w:bCs/>
@@ -2411,11 +2756,27 @@
         </w:rPr>
         <w:t>{{</w:t>
       </w:r>
-      <w:r>
-        <w:rPr>
-          <w:bCs/>
-        </w:rPr>
-        <w:t>x.name.lastfirst(</w:t>
+      <w:proofErr w:type="spellStart"/>
+      <w:r>
+        <w:rPr>
+          <w:bCs/>
+        </w:rPr>
+        <w:t>x.</w:t>
+      </w:r>
+      <w:proofErr w:type="gramStart"/>
+      <w:r>
+        <w:rPr>
+          <w:bCs/>
+        </w:rPr>
+        <w:t>name.lastfirst</w:t>
+      </w:r>
+      <w:proofErr w:type="spellEnd"/>
+      <w:proofErr w:type="gramEnd"/>
+      <w:r>
+        <w:rPr>
+          <w:bCs/>
+        </w:rPr>
+        <w:t>(</w:t>
       </w:r>
       <w:r>
         <w:rPr>
@@ -2427,8 +2788,16 @@
         <w:rPr>
           <w:bCs/>
         </w:rPr>
-        <w:t>}} {{x.name.middle</w:t>
-      </w:r>
+        <w:t>}} {{</w:t>
+      </w:r>
+      <w:proofErr w:type="spellStart"/>
+      <w:r>
+        <w:rPr>
+          <w:bCs/>
+        </w:rPr>
+        <w:t>x.name.middle</w:t>
+      </w:r>
+      <w:proofErr w:type="spellEnd"/>
       <w:r>
         <w:rPr>
           <w:bCs/>
@@ -2465,13 +2834,27 @@
         <w:rPr>
           <w:bCs/>
         </w:rPr>
-        <w:t xml:space="preserve"> x.</w:t>
-      </w:r>
-      <w:r>
-        <w:rPr>
-          <w:bCs/>
-        </w:rPr>
-        <w:t>a_number }}</w:t>
+        <w:t xml:space="preserve"> </w:t>
+      </w:r>
+      <w:proofErr w:type="spellStart"/>
+      <w:r>
+        <w:rPr>
+          <w:bCs/>
+        </w:rPr>
+        <w:t>x.</w:t>
+      </w:r>
+      <w:r>
+        <w:rPr>
+          <w:bCs/>
+        </w:rPr>
+        <w:t>a_number</w:t>
+      </w:r>
+      <w:proofErr w:type="spellEnd"/>
+      <w:r>
+        <w:rPr>
+          <w:bCs/>
+        </w:rPr>
+        <w:t xml:space="preserve"> }}</w:t>
       </w:r>
     </w:p>
     <w:p>
@@ -2487,7 +2870,21 @@
         <w:rPr>
           <w:bCs/>
         </w:rPr>
-        <w:t>{%p endfor %}</w:t>
+        <w:t xml:space="preserve">{%p </w:t>
+      </w:r>
+      <w:proofErr w:type="spellStart"/>
+      <w:r>
+        <w:rPr>
+          <w:bCs/>
+        </w:rPr>
+        <w:t>endfor</w:t>
+      </w:r>
+      <w:proofErr w:type="spellEnd"/>
+      <w:r>
+        <w:rPr>
+          <w:bCs/>
+        </w:rPr>
+        <w:t xml:space="preserve"> %}</w:t>
       </w:r>
     </w:p>
     <w:p>
@@ -2641,8 +3038,21 @@
         </w:rPr>
         <w:t xml:space="preserve"> </w:t>
       </w:r>
-      <w:r>
-        <w:t>{{ output_checkbox(False) }}</w:t>
+      <w:proofErr w:type="gramStart"/>
+      <w:r>
+        <w:t xml:space="preserve">{{ </w:t>
+      </w:r>
+      <w:proofErr w:type="spellStart"/>
+      <w:r>
+        <w:t>output</w:t>
+      </w:r>
+      <w:proofErr w:type="gramEnd"/>
+      <w:r>
+        <w:t>_checkbox</w:t>
+      </w:r>
+      <w:proofErr w:type="spellEnd"/>
+      <w:r>
+        <w:t>(False) }}</w:t>
       </w:r>
       <w:r>
         <w:rPr>
@@ -2665,7 +3075,15 @@
         <w:t xml:space="preserve">GRANTED </w:t>
       </w:r>
       <w:r>
-        <w:t>{{ output_checkbox(False) }}</w:t>
+        <w:t xml:space="preserve">{{ </w:t>
+      </w:r>
+      <w:proofErr w:type="spellStart"/>
+      <w:r>
+        <w:t>output_checkbox</w:t>
+      </w:r>
+      <w:proofErr w:type="spellEnd"/>
+      <w:r>
+        <w:t>(False) }}</w:t>
       </w:r>
       <w:r>
         <w:rPr>
@@ -2714,8 +3132,21 @@
           <w:rFonts w:eastAsia="Calibri"/>
         </w:rPr>
       </w:pPr>
-      <w:r>
-        <w:t>{{ output_checkbox(False) }}</w:t>
+      <w:proofErr w:type="gramStart"/>
+      <w:r>
+        <w:t xml:space="preserve">{{ </w:t>
+      </w:r>
+      <w:proofErr w:type="spellStart"/>
+      <w:r>
+        <w:t>output</w:t>
+      </w:r>
+      <w:proofErr w:type="gramEnd"/>
+      <w:r>
+        <w:t>_checkbox</w:t>
+      </w:r>
+      <w:proofErr w:type="spellEnd"/>
+      <w:r>
+        <w:t>(False) }}</w:t>
       </w:r>
       <w:r>
         <w:t xml:space="preserve">  </w:t>
@@ -2737,8 +3168,21 @@
           <w:rFonts w:eastAsia="Calibri"/>
         </w:rPr>
       </w:pPr>
-      <w:r>
-        <w:t>{{ output_checkbox(False) }}</w:t>
+      <w:proofErr w:type="gramStart"/>
+      <w:r>
+        <w:t xml:space="preserve">{{ </w:t>
+      </w:r>
+      <w:proofErr w:type="spellStart"/>
+      <w:r>
+        <w:t>output</w:t>
+      </w:r>
+      <w:proofErr w:type="gramEnd"/>
+      <w:r>
+        <w:t>_checkbox</w:t>
+      </w:r>
+      <w:proofErr w:type="spellEnd"/>
+      <w:r>
+        <w:t>(False) }}</w:t>
       </w:r>
       <w:r>
         <w:t xml:space="preserve">  </w:t>
@@ -2760,8 +3204,21 @@
           <w:rFonts w:eastAsia="Calibri"/>
         </w:rPr>
       </w:pPr>
-      <w:r>
-        <w:t>{{ output_checkbox(False) }}</w:t>
+      <w:proofErr w:type="gramStart"/>
+      <w:r>
+        <w:t xml:space="preserve">{{ </w:t>
+      </w:r>
+      <w:proofErr w:type="spellStart"/>
+      <w:r>
+        <w:t>output</w:t>
+      </w:r>
+      <w:proofErr w:type="gramEnd"/>
+      <w:r>
+        <w:t>_checkbox</w:t>
+      </w:r>
+      <w:proofErr w:type="spellEnd"/>
+      <w:r>
+        <w:t>(False) }}</w:t>
       </w:r>
       <w:r>
         <w:t xml:space="preserve">  </w:t>
@@ -2783,8 +3240,21 @@
           <w:rFonts w:eastAsia="Calibri"/>
         </w:rPr>
       </w:pPr>
-      <w:r>
-        <w:t>{{ output_checkbox(False) }}</w:t>
+      <w:proofErr w:type="gramStart"/>
+      <w:r>
+        <w:t xml:space="preserve">{{ </w:t>
+      </w:r>
+      <w:proofErr w:type="spellStart"/>
+      <w:r>
+        <w:t>output</w:t>
+      </w:r>
+      <w:proofErr w:type="gramEnd"/>
+      <w:r>
+        <w:t>_checkbox</w:t>
+      </w:r>
+      <w:proofErr w:type="spellEnd"/>
+      <w:r>
+        <w:t>(False) }}</w:t>
       </w:r>
       <w:r>
         <w:t xml:space="preserve">  </w:t>
@@ -2806,8 +3276,21 @@
           <w:rFonts w:eastAsia="Calibri"/>
         </w:rPr>
       </w:pPr>
-      <w:r>
-        <w:t>{{ output_checkbox(False) }}</w:t>
+      <w:proofErr w:type="gramStart"/>
+      <w:r>
+        <w:t xml:space="preserve">{{ </w:t>
+      </w:r>
+      <w:proofErr w:type="spellStart"/>
+      <w:r>
+        <w:t>output</w:t>
+      </w:r>
+      <w:proofErr w:type="gramEnd"/>
+      <w:r>
+        <w:t>_checkbox</w:t>
+      </w:r>
+      <w:proofErr w:type="spellEnd"/>
+      <w:r>
+        <w:t>(False) }}</w:t>
       </w:r>
       <w:r>
         <w:t xml:space="preserve">  </w:t>
@@ -2829,8 +3312,21 @@
           <w:rFonts w:eastAsia="Calibri"/>
         </w:rPr>
       </w:pPr>
-      <w:r>
-        <w:t>{{ output_checkbox(False) }}</w:t>
+      <w:proofErr w:type="gramStart"/>
+      <w:r>
+        <w:t xml:space="preserve">{{ </w:t>
+      </w:r>
+      <w:proofErr w:type="spellStart"/>
+      <w:r>
+        <w:t>output</w:t>
+      </w:r>
+      <w:proofErr w:type="gramEnd"/>
+      <w:r>
+        <w:t>_checkbox</w:t>
+      </w:r>
+      <w:proofErr w:type="spellEnd"/>
+      <w:r>
+        <w:t>(False) }}</w:t>
       </w:r>
       <w:r>
         <w:t xml:space="preserve">  </w:t>
@@ -2852,8 +3348,21 @@
           <w:rFonts w:eastAsia="Calibri"/>
         </w:rPr>
       </w:pPr>
-      <w:r>
-        <w:t>{{ output_checkbox(False) }}</w:t>
+      <w:proofErr w:type="gramStart"/>
+      <w:r>
+        <w:t xml:space="preserve">{{ </w:t>
+      </w:r>
+      <w:proofErr w:type="spellStart"/>
+      <w:r>
+        <w:t>output</w:t>
+      </w:r>
+      <w:proofErr w:type="gramEnd"/>
+      <w:r>
+        <w:t>_checkbox</w:t>
+      </w:r>
+      <w:proofErr w:type="spellEnd"/>
+      <w:r>
+        <w:t>(False) }}</w:t>
       </w:r>
       <w:r>
         <w:t xml:space="preserve">  </w:t>
@@ -2912,8 +3421,21 @@
           <w:rFonts w:eastAsia="Calibri"/>
         </w:rPr>
       </w:pPr>
-      <w:r>
-        <w:t>{{ output_checkbox(False) }}</w:t>
+      <w:proofErr w:type="gramStart"/>
+      <w:r>
+        <w:t xml:space="preserve">{{ </w:t>
+      </w:r>
+      <w:proofErr w:type="spellStart"/>
+      <w:r>
+        <w:t>output</w:t>
+      </w:r>
+      <w:proofErr w:type="gramEnd"/>
+      <w:r>
+        <w:t>_checkbox</w:t>
+      </w:r>
+      <w:proofErr w:type="spellEnd"/>
+      <w:r>
+        <w:t>(False) }}</w:t>
       </w:r>
       <w:r>
         <w:t xml:space="preserve">  </w:t>
@@ -2935,8 +3457,21 @@
           <w:rFonts w:eastAsia="Calibri"/>
         </w:rPr>
       </w:pPr>
-      <w:r>
-        <w:t>{{ output_checkbox(False) }}</w:t>
+      <w:proofErr w:type="gramStart"/>
+      <w:r>
+        <w:t xml:space="preserve">{{ </w:t>
+      </w:r>
+      <w:proofErr w:type="spellStart"/>
+      <w:r>
+        <w:t>output</w:t>
+      </w:r>
+      <w:proofErr w:type="gramEnd"/>
+      <w:r>
+        <w:t>_checkbox</w:t>
+      </w:r>
+      <w:proofErr w:type="spellEnd"/>
+      <w:r>
+        <w:t>(False) }}</w:t>
       </w:r>
       <w:r>
         <w:t xml:space="preserve">  </w:t>
@@ -3164,7 +3699,21 @@
         <w:rPr>
           <w:rFonts w:eastAsia="Calibri"/>
         </w:rPr>
-        <w:t xml:space="preserve">MAIL (     )   PERSONAL SERVICE (     )   ELECTRONIC SERVICE (     ) </w:t>
+        <w:t xml:space="preserve">MAIL </w:t>
+      </w:r>
+      <w:proofErr w:type="gramStart"/>
+      <w:r>
+        <w:rPr>
+          <w:rFonts w:eastAsia="Calibri"/>
+        </w:rPr>
+        <w:t xml:space="preserve">(  </w:t>
+      </w:r>
+      <w:proofErr w:type="gramEnd"/>
+      <w:r>
+        <w:rPr>
+          <w:rFonts w:eastAsia="Calibri"/>
+        </w:rPr>
+        <w:t xml:space="preserve">   )   PERSONAL SERVICE (     )   ELECTRONIC SERVICE (     ) </w:t>
       </w:r>
     </w:p>
     <w:p>
@@ -3181,7 +3730,21 @@
         <w:rPr>
           <w:rFonts w:eastAsia="Calibri"/>
         </w:rPr>
-        <w:t xml:space="preserve">TO: RESPONDENT (     )    RESPONDENT’S C/O CUSTODIAL OFFICER (     )   RESPONDENT’S ATTY/REP (     )    DHS (     ) </w:t>
+        <w:t xml:space="preserve">TO: RESPONDENT </w:t>
+      </w:r>
+      <w:proofErr w:type="gramStart"/>
+      <w:r>
+        <w:rPr>
+          <w:rFonts w:eastAsia="Calibri"/>
+        </w:rPr>
+        <w:t xml:space="preserve">(  </w:t>
+      </w:r>
+      <w:proofErr w:type="gramEnd"/>
+      <w:r>
+        <w:rPr>
+          <w:rFonts w:eastAsia="Calibri"/>
+        </w:rPr>
+        <w:t xml:space="preserve">   )    RESPONDENT’S C/O CUSTODIAL OFFICER (     )   RESPONDENT’S ATTY/REP (     )    DHS (     ) </w:t>
       </w:r>
     </w:p>
     <w:p>
@@ -3194,11 +3757,19 @@
           <w:rFonts w:eastAsia="Calibri"/>
         </w:rPr>
       </w:pPr>
-      <w:r>
-        <w:rPr>
-          <w:rFonts w:eastAsia="Calibri"/>
-        </w:rPr>
-        <w:t>DATE:____________________   BY: COURT STAFF_________________________________</w:t>
+      <w:proofErr w:type="gramStart"/>
+      <w:r>
+        <w:rPr>
+          <w:rFonts w:eastAsia="Calibri"/>
+        </w:rPr>
+        <w:t>DATE:_</w:t>
+      </w:r>
+      <w:proofErr w:type="gramEnd"/>
+      <w:r>
+        <w:rPr>
+          <w:rFonts w:eastAsia="Calibri"/>
+        </w:rPr>
+        <w:t>___________________   BY: COURT STAFF_________________________________</w:t>
       </w:r>
     </w:p>
     <w:p>
@@ -3215,7 +3786,21 @@
         <w:rPr>
           <w:rFonts w:eastAsia="Calibri"/>
         </w:rPr>
-        <w:t>ATTACHMENTS: EOIR-33 (     )   EOIR-28 (    )   LEGAL SERVICES LIST (   )    OTHER</w:t>
+        <w:t xml:space="preserve">ATTACHMENTS: EOIR-33 </w:t>
+      </w:r>
+      <w:proofErr w:type="gramStart"/>
+      <w:r>
+        <w:rPr>
+          <w:rFonts w:eastAsia="Calibri"/>
+        </w:rPr>
+        <w:t xml:space="preserve">(  </w:t>
+      </w:r>
+      <w:proofErr w:type="gramEnd"/>
+      <w:r>
+        <w:rPr>
+          <w:rFonts w:eastAsia="Calibri"/>
+        </w:rPr>
+        <w:t xml:space="preserve">   )   EOIR-28 (    )   LEGAL SERVICES LIST (   )    OTHER</w:t>
       </w:r>
     </w:p>
     <w:p>
@@ -3269,12 +3854,14 @@
         </w:rPr>
         <w:t xml:space="preserve">{%p if </w:t>
       </w:r>
+      <w:proofErr w:type="spellStart"/>
       <w:r>
         <w:rPr>
           <w:bCs/>
         </w:rPr>
         <w:t>motion_users</w:t>
       </w:r>
+      <w:proofErr w:type="spellEnd"/>
       <w:r>
         <w:rPr>
           <w:bCs/>
@@ -3297,18 +3884,89 @@
           <w:bCs/>
         </w:rPr>
       </w:pPr>
+      <w:proofErr w:type="gramStart"/>
       <w:r>
         <w:rPr>
           <w:bCs/>
         </w:rPr>
         <w:t xml:space="preserve">{{ </w:t>
       </w:r>
+      <w:proofErr w:type="spellStart"/>
+      <w:r>
+        <w:rPr>
+          <w:bCs/>
+        </w:rPr>
+        <w:t>motion</w:t>
+      </w:r>
+      <w:proofErr w:type="gramEnd"/>
+      <w:r>
+        <w:rPr>
+          <w:bCs/>
+        </w:rPr>
+        <w:t>_users</w:t>
+      </w:r>
+      <w:proofErr w:type="spellEnd"/>
+      <w:r>
+        <w:rPr>
+          <w:bCs/>
+        </w:rPr>
+        <w:t>[0</w:t>
+      </w:r>
+      <w:r>
+        <w:rPr>
+          <w:bCs/>
+        </w:rPr>
+        <w:t>]</w:t>
+      </w:r>
+      <w:r>
+        <w:rPr>
+          <w:bCs/>
+        </w:rPr>
+        <w:t>.</w:t>
+      </w:r>
+      <w:proofErr w:type="spellStart"/>
+      <w:r>
+        <w:rPr>
+          <w:bCs/>
+        </w:rPr>
+        <w:t>name</w:t>
+      </w:r>
+      <w:r>
+        <w:rPr>
+          <w:bCs/>
+        </w:rPr>
+        <w:t>.lastfirst</w:t>
+      </w:r>
+      <w:proofErr w:type="spellEnd"/>
+      <w:r>
+        <w:rPr>
+          <w:bCs/>
+        </w:rPr>
+        <w:t>()</w:t>
+      </w:r>
+      <w:r>
+        <w:rPr>
+          <w:bCs/>
+        </w:rPr>
+        <w:t>}}</w:t>
+      </w:r>
+      <w:r>
+        <w:t xml:space="preserve"> </w:t>
+      </w:r>
+      <w:r>
+        <w:rPr>
+          <w:bCs/>
+        </w:rPr>
+        <w:t xml:space="preserve">{{ </w:t>
+      </w:r>
+      <w:proofErr w:type="spellStart"/>
       <w:r>
         <w:rPr>
           <w:bCs/>
         </w:rPr>
         <w:t>motion_users</w:t>
       </w:r>
+      <w:proofErr w:type="spellEnd"/>
       <w:r>
         <w:rPr>
           <w:bCs/>
@@ -3325,58 +3983,27 @@
         <w:rPr>
           <w:bCs/>
         </w:rPr>
-        <w:t>.name</w:t>
-      </w:r>
-      <w:r>
-        <w:rPr>
-          <w:bCs/>
-        </w:rPr>
-        <w:t>.lastfirst()</w:t>
-      </w:r>
-      <w:r>
-        <w:rPr>
-          <w:bCs/>
-        </w:rPr>
-        <w:t>}}</w:t>
-      </w:r>
-      <w:r>
-        <w:t xml:space="preserve"> </w:t>
-      </w:r>
-      <w:r>
-        <w:rPr>
-          <w:bCs/>
-        </w:rPr>
-        <w:t xml:space="preserve">{{ </w:t>
-      </w:r>
-      <w:r>
-        <w:rPr>
-          <w:bCs/>
-        </w:rPr>
-        <w:t>motion_users</w:t>
-      </w:r>
-      <w:r>
-        <w:rPr>
-          <w:bCs/>
-        </w:rPr>
-        <w:t>[0</w:t>
-      </w:r>
-      <w:r>
-        <w:rPr>
-          <w:bCs/>
-        </w:rPr>
-        <w:t>]</w:t>
-      </w:r>
-      <w:r>
-        <w:rPr>
-          <w:bCs/>
-        </w:rPr>
-        <w:t>.name</w:t>
-      </w:r>
-      <w:r>
-        <w:rPr>
-          <w:bCs/>
-        </w:rPr>
-        <w:t xml:space="preserve">.middle </w:t>
+        <w:t>.</w:t>
+      </w:r>
+      <w:proofErr w:type="spellStart"/>
+      <w:r>
+        <w:rPr>
+          <w:bCs/>
+        </w:rPr>
+        <w:t>name</w:t>
+      </w:r>
+      <w:r>
+        <w:rPr>
+          <w:bCs/>
+        </w:rPr>
+        <w:t>.middle</w:t>
+      </w:r>
+      <w:proofErr w:type="spellEnd"/>
+      <w:r>
+        <w:rPr>
+          <w:bCs/>
+        </w:rPr>
+        <w:t xml:space="preserve"> </w:t>
       </w:r>
       <w:r>
         <w:rPr>
@@ -3410,12 +4037,14 @@
         </w:rPr>
         <w:t xml:space="preserve">A# {{ </w:t>
       </w:r>
+      <w:proofErr w:type="spellStart"/>
       <w:r>
         <w:rPr>
           <w:bCs/>
         </w:rPr>
         <w:t>motion_users</w:t>
       </w:r>
+      <w:proofErr w:type="spellEnd"/>
       <w:r>
         <w:rPr>
           <w:bCs/>
@@ -3428,11 +4057,19 @@
         </w:rPr>
         <w:t>].</w:t>
       </w:r>
-      <w:r>
-        <w:rPr>
-          <w:bCs/>
-        </w:rPr>
-        <w:t>a_number }}</w:t>
+      <w:proofErr w:type="spellStart"/>
+      <w:r>
+        <w:rPr>
+          <w:bCs/>
+        </w:rPr>
+        <w:t>a_number</w:t>
+      </w:r>
+      <w:proofErr w:type="spellEnd"/>
+      <w:r>
+        <w:rPr>
+          <w:bCs/>
+        </w:rPr>
+        <w:t xml:space="preserve"> }}</w:t>
       </w:r>
     </w:p>
     <w:p>
@@ -3499,12 +4136,14 @@
         </w:rPr>
         <w:t xml:space="preserve">{%p for x in </w:t>
       </w:r>
+      <w:proofErr w:type="spellStart"/>
       <w:r>
         <w:rPr>
           <w:bCs/>
         </w:rPr>
         <w:t>motion_users</w:t>
       </w:r>
+      <w:proofErr w:type="spellEnd"/>
       <w:r>
         <w:rPr>
           <w:bCs/>
@@ -3527,11 +4166,27 @@
         </w:rPr>
         <w:t>{{</w:t>
       </w:r>
-      <w:r>
-        <w:rPr>
-          <w:bCs/>
-        </w:rPr>
-        <w:t>x.name.lastfirst(</w:t>
+      <w:proofErr w:type="spellStart"/>
+      <w:r>
+        <w:rPr>
+          <w:bCs/>
+        </w:rPr>
+        <w:t>x.</w:t>
+      </w:r>
+      <w:proofErr w:type="gramStart"/>
+      <w:r>
+        <w:rPr>
+          <w:bCs/>
+        </w:rPr>
+        <w:t>name.lastfirst</w:t>
+      </w:r>
+      <w:proofErr w:type="spellEnd"/>
+      <w:proofErr w:type="gramEnd"/>
+      <w:r>
+        <w:rPr>
+          <w:bCs/>
+        </w:rPr>
+        <w:t>(</w:t>
       </w:r>
       <w:r>
         <w:rPr>
@@ -3543,8 +4198,16 @@
         <w:rPr>
           <w:bCs/>
         </w:rPr>
-        <w:t>}} {{x.name.middle</w:t>
-      </w:r>
+        <w:t>}} {{</w:t>
+      </w:r>
+      <w:proofErr w:type="spellStart"/>
+      <w:r>
+        <w:rPr>
+          <w:bCs/>
+        </w:rPr>
+        <w:t>x.name.middle</w:t>
+      </w:r>
+      <w:proofErr w:type="spellEnd"/>
       <w:r>
         <w:rPr>
           <w:bCs/>
@@ -3581,13 +4244,27 @@
         <w:rPr>
           <w:bCs/>
         </w:rPr>
-        <w:t xml:space="preserve"> x.</w:t>
-      </w:r>
-      <w:r>
-        <w:rPr>
-          <w:bCs/>
-        </w:rPr>
-        <w:t>a_number }}</w:t>
+        <w:t xml:space="preserve"> </w:t>
+      </w:r>
+      <w:proofErr w:type="spellStart"/>
+      <w:r>
+        <w:rPr>
+          <w:bCs/>
+        </w:rPr>
+        <w:t>x.</w:t>
+      </w:r>
+      <w:r>
+        <w:rPr>
+          <w:bCs/>
+        </w:rPr>
+        <w:t>a_number</w:t>
+      </w:r>
+      <w:proofErr w:type="spellEnd"/>
+      <w:r>
+        <w:rPr>
+          <w:bCs/>
+        </w:rPr>
+        <w:t xml:space="preserve"> }}</w:t>
       </w:r>
     </w:p>
     <w:p>
@@ -3603,7 +4280,21 @@
         <w:rPr>
           <w:bCs/>
         </w:rPr>
-        <w:t>{%p endfor %}</w:t>
+        <w:t xml:space="preserve">{%p </w:t>
+      </w:r>
+      <w:proofErr w:type="spellStart"/>
+      <w:r>
+        <w:rPr>
+          <w:bCs/>
+        </w:rPr>
+        <w:t>endfor</w:t>
+      </w:r>
+      <w:proofErr w:type="spellEnd"/>
+      <w:r>
+        <w:rPr>
+          <w:bCs/>
+        </w:rPr>
+        <w:t xml:space="preserve"> %}</w:t>
       </w:r>
     </w:p>
     <w:p>
@@ -3696,12 +4387,14 @@
         </w:rPr>
         <w:t xml:space="preserve">{% if </w:t>
       </w:r>
+      <w:proofErr w:type="spellStart"/>
       <w:r>
         <w:rPr>
           <w:bCs/>
         </w:rPr>
         <w:t>cert_of_service</w:t>
       </w:r>
+      <w:proofErr w:type="spellEnd"/>
       <w:r>
         <w:rPr>
           <w:bCs/>
@@ -3715,7 +4408,15 @@
         <w:t>%}</w:t>
       </w:r>
       <w:r>
-        <w:t>{{ today().format("MM/dd/yyyy"</w:t>
+        <w:t>{{ today().format("MM/dd/</w:t>
+      </w:r>
+      <w:proofErr w:type="spellStart"/>
+      <w:r>
+        <w:t>yyyy</w:t>
+      </w:r>
+      <w:proofErr w:type="spellEnd"/>
+      <w:r>
+        <w:t>"</w:t>
       </w:r>
       <w:r>
         <w:t xml:space="preserve">) </w:t>
@@ -3735,11 +4436,19 @@
         </w:rPr>
         <w:t xml:space="preserve">{{ </w:t>
       </w:r>
-      <w:r>
-        <w:rPr>
-          <w:bCs/>
-        </w:rPr>
-        <w:t>motion_users[0]</w:t>
+      <w:proofErr w:type="spellStart"/>
+      <w:r>
+        <w:rPr>
+          <w:bCs/>
+        </w:rPr>
+        <w:t>motion_users</w:t>
+      </w:r>
+      <w:proofErr w:type="spellEnd"/>
+      <w:r>
+        <w:rPr>
+          <w:bCs/>
+        </w:rPr>
+        <w:t>[0]</w:t>
       </w:r>
       <w:r>
         <w:rPr>
@@ -3747,6 +4456,7 @@
         </w:rPr>
         <w:t>.</w:t>
       </w:r>
+      <w:proofErr w:type="spellStart"/>
       <w:r>
         <w:rPr>
           <w:bCs/>
@@ -3765,6 +4475,7 @@
         </w:rPr>
         <w:t>full</w:t>
       </w:r>
+      <w:proofErr w:type="spellEnd"/>
       <w:r>
         <w:rPr>
           <w:bCs/>
@@ -3835,6 +4546,7 @@
         </w:rPr>
         <w:t xml:space="preserve">{{ </w:t>
       </w:r>
+      <w:proofErr w:type="spellStart"/>
       <w:r>
         <w:rPr>
           <w:bCs/>
@@ -3857,7 +4569,14 @@
         <w:rPr>
           <w:bCs/>
         </w:rPr>
-        <w:t>city }},</w:t>
+        <w:t>city</w:t>
+      </w:r>
+      <w:proofErr w:type="spellEnd"/>
+      <w:r>
+        <w:rPr>
+          <w:bCs/>
+        </w:rPr>
+        <w:t xml:space="preserve"> }},</w:t>
       </w:r>
       <w:r>
         <w:rPr>
@@ -3871,6 +4590,7 @@
         </w:rPr>
         <w:t xml:space="preserve">{{ </w:t>
       </w:r>
+      <w:proofErr w:type="spellStart"/>
       <w:r>
         <w:rPr>
           <w:bCs/>
@@ -3893,7 +4613,14 @@
         <w:rPr>
           <w:bCs/>
         </w:rPr>
-        <w:t>state }}</w:t>
+        <w:t>state</w:t>
+      </w:r>
+      <w:proofErr w:type="spellEnd"/>
+      <w:r>
+        <w:rPr>
+          <w:bCs/>
+        </w:rPr>
+        <w:t xml:space="preserve"> }}</w:t>
       </w:r>
       <w:r>
         <w:rPr>
@@ -3921,6 +4648,7 @@
       <w:r>
         <w:t xml:space="preserve">{ </w:t>
       </w:r>
+      <w:proofErr w:type="spellStart"/>
       <w:r>
         <w:rPr>
           <w:bCs/>
@@ -3934,7 +4662,11 @@
         <w:t>.address</w:t>
       </w:r>
       <w:r>
-        <w:t>.on_one_line(</w:t>
+        <w:t>.on_one_line</w:t>
+      </w:r>
+      <w:proofErr w:type="spellEnd"/>
+      <w:r>
+        <w:t>(</w:t>
       </w:r>
       <w:r>
         <w:t>bare=True</w:t>
@@ -5853,27 +6585,6 @@
 </file>
 
 <file path=customXml/item1.xml><?xml version="1.0" encoding="utf-8"?>
-<?mso-contentType ?>
-<FormTemplates xmlns="http://schemas.microsoft.com/sharepoint/v3/contenttype/forms">
-  <Display>DocumentLibraryForm</Display>
-  <Edit>DocumentLibraryForm</Edit>
-  <New>DocumentLibraryForm</New>
-</FormTemplates>
-</file>
-
-<file path=customXml/item2.xml><?xml version="1.0" encoding="utf-8"?>
-<p:properties xmlns:p="http://schemas.microsoft.com/office/2006/metadata/properties" xmlns:xsi="http://www.w3.org/2001/XMLSchema-instance" xmlns:pc="http://schemas.microsoft.com/office/infopath/2007/PartnerControls">
-  <documentManagement>
-    <TaxCatchAll xmlns="fc2e0b91-73db-4711-986b-9e7114b1c780" xsi:nil="true"/>
-    <lcf76f155ced4ddcb4097134ff3c332f xmlns="aa22b7f0-1c77-4983-9187-bff8e7aaefd5">
-      <Terms xmlns="http://schemas.microsoft.com/office/infopath/2007/PartnerControls"/>
-    </lcf76f155ced4ddcb4097134ff3c332f>
-    <Note xmlns="aa22b7f0-1c77-4983-9187-bff8e7aaefd5" xsi:nil="true"/>
-  </documentManagement>
-</p:properties>
-</file>
-
-<file path=customXml/item3.xml><?xml version="1.0" encoding="utf-8"?>
 <ct:contentTypeSchema xmlns:ct="http://schemas.microsoft.com/office/2006/metadata/contentType" xmlns:ma="http://schemas.microsoft.com/office/2006/metadata/properties/metaAttributes" ct:_="" ma:_="" ma:contentTypeName="Document" ma:contentTypeID="0x01010041FCC52ECBA99C44897D8B99E45B6EB2" ma:contentTypeVersion="20" ma:contentTypeDescription="Create a new document." ma:contentTypeScope="" ma:versionID="98dd51a1eb8d717f429cfb72bbcdf291">
   <xsd:schema xmlns:xsd="http://www.w3.org/2001/XMLSchema" xmlns:xs="http://www.w3.org/2001/XMLSchema" xmlns:p="http://schemas.microsoft.com/office/2006/metadata/properties" xmlns:ns2="aa22b7f0-1c77-4983-9187-bff8e7aaefd5" xmlns:ns3="fc2e0b91-73db-4711-986b-9e7114b1c780" targetNamespace="http://schemas.microsoft.com/office/2006/metadata/properties" ma:root="true" ma:fieldsID="764fccced344541160bdf3d7a4f43fd4" ns2:_="" ns3:_="">
     <xsd:import namespace="aa22b7f0-1c77-4983-9187-bff8e7aaefd5"/>
@@ -6130,10 +6841,42 @@
 </ct:contentTypeSchema>
 </file>
 
+<file path=customXml/item2.xml><?xml version="1.0" encoding="utf-8"?>
+<p:properties xmlns:p="http://schemas.microsoft.com/office/2006/metadata/properties" xmlns:xsi="http://www.w3.org/2001/XMLSchema-instance" xmlns:pc="http://schemas.microsoft.com/office/infopath/2007/PartnerControls">
+  <documentManagement>
+    <TaxCatchAll xmlns="fc2e0b91-73db-4711-986b-9e7114b1c780" xsi:nil="true"/>
+    <lcf76f155ced4ddcb4097134ff3c332f xmlns="aa22b7f0-1c77-4983-9187-bff8e7aaefd5">
+      <Terms xmlns="http://schemas.microsoft.com/office/infopath/2007/PartnerControls"/>
+    </lcf76f155ced4ddcb4097134ff3c332f>
+    <Note xmlns="aa22b7f0-1c77-4983-9187-bff8e7aaefd5" xsi:nil="true"/>
+  </documentManagement>
+</p:properties>
+</file>
+
+<file path=customXml/item3.xml><?xml version="1.0" encoding="utf-8"?>
+<?mso-contentType ?>
+<FormTemplates xmlns="http://schemas.microsoft.com/sharepoint/v3/contenttype/forms">
+  <Display>DocumentLibraryForm</Display>
+  <Edit>DocumentLibraryForm</Edit>
+  <New>DocumentLibraryForm</New>
+</FormTemplates>
+</file>
+
 <file path=customXml/itemProps1.xml><?xml version="1.0" encoding="utf-8"?>
-<ds:datastoreItem xmlns:ds="http://schemas.openxmlformats.org/officeDocument/2006/customXml" ds:itemID="{61801A56-0FD2-4394-93D8-612F28940603}">
+<ds:datastoreItem xmlns:ds="http://schemas.openxmlformats.org/officeDocument/2006/customXml" ds:itemID="{82045B43-7134-4D42-9F91-65658FCA0A3C}">
   <ds:schemaRefs>
-    <ds:schemaRef ds:uri="http://schemas.microsoft.com/sharepoint/v3/contenttype/forms"/>
+    <ds:schemaRef ds:uri="http://schemas.microsoft.com/office/2006/metadata/contentType"/>
+    <ds:schemaRef ds:uri="http://schemas.microsoft.com/office/2006/metadata/properties/metaAttributes"/>
+    <ds:schemaRef ds:uri="http://www.w3.org/2001/XMLSchema"/>
+    <ds:schemaRef ds:uri="http://schemas.microsoft.com/office/2006/metadata/properties"/>
+    <ds:schemaRef ds:uri="aa22b7f0-1c77-4983-9187-bff8e7aaefd5"/>
+    <ds:schemaRef ds:uri="fc2e0b91-73db-4711-986b-9e7114b1c780"/>
+    <ds:schemaRef ds:uri="http://schemas.microsoft.com/office/2006/documentManagement/types"/>
+    <ds:schemaRef ds:uri="http://schemas.microsoft.com/office/infopath/2007/PartnerControls"/>
+    <ds:schemaRef ds:uri="http://schemas.openxmlformats.org/package/2006/metadata/core-properties"/>
+    <ds:schemaRef ds:uri="http://purl.org/dc/elements/1.1/"/>
+    <ds:schemaRef ds:uri="http://purl.org/dc/terms/"/>
+    <ds:schemaRef ds:uri="http://schemas.microsoft.com/internal/obd"/>
   </ds:schemaRefs>
 </ds:datastoreItem>
 </file>
@@ -6150,20 +6893,9 @@
 </file>
 
 <file path=customXml/itemProps3.xml><?xml version="1.0" encoding="utf-8"?>
-<ds:datastoreItem xmlns:ds="http://schemas.openxmlformats.org/officeDocument/2006/customXml" ds:itemID="{82045B43-7134-4D42-9F91-65658FCA0A3C}">
+<ds:datastoreItem xmlns:ds="http://schemas.openxmlformats.org/officeDocument/2006/customXml" ds:itemID="{61801A56-0FD2-4394-93D8-612F28940603}">
   <ds:schemaRefs>
-    <ds:schemaRef ds:uri="http://schemas.microsoft.com/office/2006/metadata/contentType"/>
-    <ds:schemaRef ds:uri="http://schemas.microsoft.com/office/2006/metadata/properties/metaAttributes"/>
-    <ds:schemaRef ds:uri="http://www.w3.org/2001/XMLSchema"/>
-    <ds:schemaRef ds:uri="http://schemas.microsoft.com/office/2006/metadata/properties"/>
-    <ds:schemaRef ds:uri="aa22b7f0-1c77-4983-9187-bff8e7aaefd5"/>
-    <ds:schemaRef ds:uri="fc2e0b91-73db-4711-986b-9e7114b1c780"/>
-    <ds:schemaRef ds:uri="http://schemas.microsoft.com/office/2006/documentManagement/types"/>
-    <ds:schemaRef ds:uri="http://schemas.microsoft.com/office/infopath/2007/PartnerControls"/>
-    <ds:schemaRef ds:uri="http://schemas.openxmlformats.org/package/2006/metadata/core-properties"/>
-    <ds:schemaRef ds:uri="http://purl.org/dc/elements/1.1/"/>
-    <ds:schemaRef ds:uri="http://purl.org/dc/terms/"/>
-    <ds:schemaRef ds:uri="http://schemas.microsoft.com/internal/obd"/>
+    <ds:schemaRef ds:uri="http://schemas.microsoft.com/sharepoint/v3/contenttype/forms"/>
   </ds:schemaRefs>
 </ds:datastoreItem>
 </file>
</xml_diff>

<commit_message>
More updates to the COV Motion and removed the  from interview.
</commit_message>
<xml_diff>
--- a/docassemble/USCISApplications/data/templates/COV_motion.docx
+++ b/docassemble/USCISApplications/data/templates/COV_motion.docx
@@ -2094,7 +2094,44 @@
         <w:t>') }}</w:t>
       </w:r>
       <w:r>
-        <w:t xml:space="preserve">, I have not appeared before an immigration judge and I have not submitted pleadings for my Notice to Appear. </w:t>
+        <w:t>, I</w:t>
+      </w:r>
+      <w:r>
+        <w:t xml:space="preserve"> have not appeared before an immigration judge and I have not submitted pleadings for my Notice to Appear dated</w:t>
+      </w:r>
+      <w:r>
+        <w:t xml:space="preserve"> </w:t>
+      </w:r>
+      <w:r>
+        <w:t>{{</w:t>
+      </w:r>
+      <w:r>
+        <w:t xml:space="preserve"> </w:t>
+      </w:r>
+      <w:proofErr w:type="spellStart"/>
+      <w:r>
+        <w:t>notice_appear_date</w:t>
+      </w:r>
+      <w:r>
+        <w:t>.format</w:t>
+      </w:r>
+      <w:proofErr w:type="spellEnd"/>
+      <w:r>
+        <w:t>('MM</w:t>
+      </w:r>
+      <w:r>
+        <w:t xml:space="preserve">MM d, </w:t>
+      </w:r>
+      <w:proofErr w:type="spellStart"/>
+      <w:r>
+        <w:t>yyyy</w:t>
+      </w:r>
+      <w:proofErr w:type="spellEnd"/>
+      <w:r>
+        <w:t>') }}</w:t>
+      </w:r>
+      <w:r>
+        <w:t>.</w:t>
       </w:r>
     </w:p>
     <w:p>
@@ -2117,7 +2154,23 @@
           <w:sz w:val="23"/>
           <w:szCs w:val="23"/>
         </w:rPr>
-        <w:t>n the Immigration Court Practice Manual does not require pleadings for motions to change venue, I am omitting pleadings from this motion because I would like to discuss the case with an attorney before entering pleadings. See ICPM Chap. 5.10(c).</w:t>
+        <w:t xml:space="preserve">n the Immigration Court Practice Manual does not require pleadings for motions to change venue, I am omitting pleadings from this motion because I would like to discuss the case with an attorney before entering pleadings. </w:t>
+      </w:r>
+      <w:r>
+        <w:rPr>
+          <w:i/>
+          <w:iCs/>
+          <w:sz w:val="23"/>
+          <w:szCs w:val="23"/>
+        </w:rPr>
+        <w:t>See</w:t>
+      </w:r>
+      <w:r>
+        <w:rPr>
+          <w:sz w:val="23"/>
+          <w:szCs w:val="23"/>
+        </w:rPr>
+        <w:t xml:space="preserve"> ICPM Chap. 5.10(c).</w:t>
       </w:r>
     </w:p>
     <w:p>
@@ -2181,6 +2234,7 @@
     </w:p>
     <w:p>
       <w:r>
+        <w:lastRenderedPageBreak/>
         <w:t>Name</w:t>
       </w:r>
       <w:r>
@@ -6585,6 +6639,27 @@
 </file>
 
 <file path=customXml/item1.xml><?xml version="1.0" encoding="utf-8"?>
+<?mso-contentType ?>
+<FormTemplates xmlns="http://schemas.microsoft.com/sharepoint/v3/contenttype/forms">
+  <Display>DocumentLibraryForm</Display>
+  <Edit>DocumentLibraryForm</Edit>
+  <New>DocumentLibraryForm</New>
+</FormTemplates>
+</file>
+
+<file path=customXml/item2.xml><?xml version="1.0" encoding="utf-8"?>
+<p:properties xmlns:p="http://schemas.microsoft.com/office/2006/metadata/properties" xmlns:xsi="http://www.w3.org/2001/XMLSchema-instance" xmlns:pc="http://schemas.microsoft.com/office/infopath/2007/PartnerControls">
+  <documentManagement>
+    <TaxCatchAll xmlns="fc2e0b91-73db-4711-986b-9e7114b1c780" xsi:nil="true"/>
+    <lcf76f155ced4ddcb4097134ff3c332f xmlns="aa22b7f0-1c77-4983-9187-bff8e7aaefd5">
+      <Terms xmlns="http://schemas.microsoft.com/office/infopath/2007/PartnerControls"/>
+    </lcf76f155ced4ddcb4097134ff3c332f>
+    <Note xmlns="aa22b7f0-1c77-4983-9187-bff8e7aaefd5" xsi:nil="true"/>
+  </documentManagement>
+</p:properties>
+</file>
+
+<file path=customXml/item3.xml><?xml version="1.0" encoding="utf-8"?>
 <ct:contentTypeSchema xmlns:ct="http://schemas.microsoft.com/office/2006/metadata/contentType" xmlns:ma="http://schemas.microsoft.com/office/2006/metadata/properties/metaAttributes" ct:_="" ma:_="" ma:contentTypeName="Document" ma:contentTypeID="0x01010041FCC52ECBA99C44897D8B99E45B6EB2" ma:contentTypeVersion="20" ma:contentTypeDescription="Create a new document." ma:contentTypeScope="" ma:versionID="98dd51a1eb8d717f429cfb72bbcdf291">
   <xsd:schema xmlns:xsd="http://www.w3.org/2001/XMLSchema" xmlns:xs="http://www.w3.org/2001/XMLSchema" xmlns:p="http://schemas.microsoft.com/office/2006/metadata/properties" xmlns:ns2="aa22b7f0-1c77-4983-9187-bff8e7aaefd5" xmlns:ns3="fc2e0b91-73db-4711-986b-9e7114b1c780" targetNamespace="http://schemas.microsoft.com/office/2006/metadata/properties" ma:root="true" ma:fieldsID="764fccced344541160bdf3d7a4f43fd4" ns2:_="" ns3:_="">
     <xsd:import namespace="aa22b7f0-1c77-4983-9187-bff8e7aaefd5"/>
@@ -6841,28 +6916,26 @@
 </ct:contentTypeSchema>
 </file>
 
-<file path=customXml/item2.xml><?xml version="1.0" encoding="utf-8"?>
-<p:properties xmlns:p="http://schemas.microsoft.com/office/2006/metadata/properties" xmlns:xsi="http://www.w3.org/2001/XMLSchema-instance" xmlns:pc="http://schemas.microsoft.com/office/infopath/2007/PartnerControls">
-  <documentManagement>
-    <TaxCatchAll xmlns="fc2e0b91-73db-4711-986b-9e7114b1c780" xsi:nil="true"/>
-    <lcf76f155ced4ddcb4097134ff3c332f xmlns="aa22b7f0-1c77-4983-9187-bff8e7aaefd5">
-      <Terms xmlns="http://schemas.microsoft.com/office/infopath/2007/PartnerControls"/>
-    </lcf76f155ced4ddcb4097134ff3c332f>
-    <Note xmlns="aa22b7f0-1c77-4983-9187-bff8e7aaefd5" xsi:nil="true"/>
-  </documentManagement>
-</p:properties>
+<file path=customXml/itemProps1.xml><?xml version="1.0" encoding="utf-8"?>
+<ds:datastoreItem xmlns:ds="http://schemas.openxmlformats.org/officeDocument/2006/customXml" ds:itemID="{61801A56-0FD2-4394-93D8-612F28940603}">
+  <ds:schemaRefs>
+    <ds:schemaRef ds:uri="http://schemas.microsoft.com/sharepoint/v3/contenttype/forms"/>
+  </ds:schemaRefs>
+</ds:datastoreItem>
 </file>
 
-<file path=customXml/item3.xml><?xml version="1.0" encoding="utf-8"?>
-<?mso-contentType ?>
-<FormTemplates xmlns="http://schemas.microsoft.com/sharepoint/v3/contenttype/forms">
-  <Display>DocumentLibraryForm</Display>
-  <Edit>DocumentLibraryForm</Edit>
-  <New>DocumentLibraryForm</New>
-</FormTemplates>
+<file path=customXml/itemProps2.xml><?xml version="1.0" encoding="utf-8"?>
+<ds:datastoreItem xmlns:ds="http://schemas.openxmlformats.org/officeDocument/2006/customXml" ds:itemID="{20C66F9F-F7B4-4B87-8910-A2DDB634D5E0}">
+  <ds:schemaRefs>
+    <ds:schemaRef ds:uri="http://schemas.microsoft.com/office/2006/metadata/properties"/>
+    <ds:schemaRef ds:uri="http://schemas.microsoft.com/office/infopath/2007/PartnerControls"/>
+    <ds:schemaRef ds:uri="fc2e0b91-73db-4711-986b-9e7114b1c780"/>
+    <ds:schemaRef ds:uri="aa22b7f0-1c77-4983-9187-bff8e7aaefd5"/>
+  </ds:schemaRefs>
+</ds:datastoreItem>
 </file>
 
-<file path=customXml/itemProps1.xml><?xml version="1.0" encoding="utf-8"?>
+<file path=customXml/itemProps3.xml><?xml version="1.0" encoding="utf-8"?>
 <ds:datastoreItem xmlns:ds="http://schemas.openxmlformats.org/officeDocument/2006/customXml" ds:itemID="{82045B43-7134-4D42-9F91-65658FCA0A3C}">
   <ds:schemaRefs>
     <ds:schemaRef ds:uri="http://schemas.microsoft.com/office/2006/metadata/contentType"/>
@@ -6879,23 +6952,4 @@
     <ds:schemaRef ds:uri="http://schemas.microsoft.com/internal/obd"/>
   </ds:schemaRefs>
 </ds:datastoreItem>
-</file>
-
-<file path=customXml/itemProps2.xml><?xml version="1.0" encoding="utf-8"?>
-<ds:datastoreItem xmlns:ds="http://schemas.openxmlformats.org/officeDocument/2006/customXml" ds:itemID="{20C66F9F-F7B4-4B87-8910-A2DDB634D5E0}">
-  <ds:schemaRefs>
-    <ds:schemaRef ds:uri="http://schemas.microsoft.com/office/2006/metadata/properties"/>
-    <ds:schemaRef ds:uri="http://schemas.microsoft.com/office/infopath/2007/PartnerControls"/>
-    <ds:schemaRef ds:uri="fc2e0b91-73db-4711-986b-9e7114b1c780"/>
-    <ds:schemaRef ds:uri="aa22b7f0-1c77-4983-9187-bff8e7aaefd5"/>
-  </ds:schemaRefs>
-</ds:datastoreItem>
-</file>
-
-<file path=customXml/itemProps3.xml><?xml version="1.0" encoding="utf-8"?>
-<ds:datastoreItem xmlns:ds="http://schemas.openxmlformats.org/officeDocument/2006/customXml" ds:itemID="{61801A56-0FD2-4394-93D8-612F28940603}">
-  <ds:schemaRefs>
-    <ds:schemaRef ds:uri="http://schemas.microsoft.com/sharepoint/v3/contenttype/forms"/>
-  </ds:schemaRefs>
-</ds:datastoreItem>
 </file>
</xml_diff>